<commit_message>
Update statistics.json timestamps and add new Menger and Rosen documents
- Revised last_updated timestamps in statistics.json for improved accuracy.
- Added new Word and PDF documents related to Menger and Rosen, enhancing the project's resource library.
- Deleted outdated PDF files to streamline documentation.

These changes improve project organization and support ongoing collaboration among team members.
</commit_message>
<xml_diff>
--- a/docs/Menger/Companion_Volume_Formatting_Guide.docx
+++ b/docs/Menger/Companion_Volume_Formatting_Guide.docx
@@ -94,7 +94,13 @@
       </w:r>
       <w:r>
         <w:br/>
-        <w:t>- Integrated Commentary (Blue/Red interwoven)</w:t>
+        <w:t>- Integrated Commentary (Blue/Red</w:t>
+      </w:r>
+      <w:r>
+        <w:t>/Black</w:t>
+      </w:r>
+      <w:r>
+        <w:t xml:space="preserve"> interwoven)</w:t>
       </w:r>
       <w:r>
         <w:br/>

</xml_diff>